<commit_message>
feat: overhaul student interface with premium dark-glass UI, redesign student dashboard, and fix messaging layout issues
</commit_message>
<xml_diff>
--- a/Questions/Class 7/ch1.docx
+++ b/Questions/Class 7/ch1.docx
@@ -15,8 +15,13 @@
         <w:pStyle w:val="NoSpacing"/>
       </w:pPr>
       <w:r>
-        <w:t>Type: mcq</w:t>
-      </w:r>
+        <w:t xml:space="preserve">Type: </w:t>
+      </w:r>
+      <w:proofErr w:type="spellStart"/>
+      <w:r>
+        <w:t>mcq</w:t>
+      </w:r>
+      <w:proofErr w:type="spellEnd"/>
     </w:p>
     <w:p>
       <w:pPr>
@@ -71,8 +76,13 @@
         <w:pStyle w:val="NoSpacing"/>
       </w:pPr>
       <w:r>
-        <w:t>Type: mcq</w:t>
-      </w:r>
+        <w:t xml:space="preserve">Type: </w:t>
+      </w:r>
+      <w:proofErr w:type="spellStart"/>
+      <w:r>
+        <w:t>mcq</w:t>
+      </w:r>
+      <w:proofErr w:type="spellEnd"/>
     </w:p>
     <w:p>
       <w:pPr>
@@ -127,8 +137,13 @@
         <w:pStyle w:val="NoSpacing"/>
       </w:pPr>
       <w:r>
-        <w:t>Type: mcq</w:t>
-      </w:r>
+        <w:t xml:space="preserve">Type: </w:t>
+      </w:r>
+      <w:proofErr w:type="spellStart"/>
+      <w:r>
+        <w:t>mcq</w:t>
+      </w:r>
+      <w:proofErr w:type="spellEnd"/>
     </w:p>
     <w:p>
       <w:pPr>
@@ -183,8 +198,13 @@
         <w:pStyle w:val="NoSpacing"/>
       </w:pPr>
       <w:r>
-        <w:t>Type: mcq</w:t>
-      </w:r>
+        <w:t xml:space="preserve">Type: </w:t>
+      </w:r>
+      <w:proofErr w:type="spellStart"/>
+      <w:r>
+        <w:t>mcq</w:t>
+      </w:r>
+      <w:proofErr w:type="spellEnd"/>
     </w:p>
     <w:p>
       <w:pPr>
@@ -239,8 +259,13 @@
         <w:pStyle w:val="NoSpacing"/>
       </w:pPr>
       <w:r>
-        <w:t>Type: mcq</w:t>
-      </w:r>
+        <w:t xml:space="preserve">Type: </w:t>
+      </w:r>
+      <w:proofErr w:type="spellStart"/>
+      <w:r>
+        <w:t>mcq</w:t>
+      </w:r>
+      <w:proofErr w:type="spellEnd"/>
     </w:p>
     <w:p>
       <w:pPr>
@@ -295,8 +320,13 @@
         <w:pStyle w:val="NoSpacing"/>
       </w:pPr>
       <w:r>
-        <w:t>Type: mcq</w:t>
-      </w:r>
+        <w:t xml:space="preserve">Type: </w:t>
+      </w:r>
+      <w:proofErr w:type="spellStart"/>
+      <w:r>
+        <w:t>mcq</w:t>
+      </w:r>
+      <w:proofErr w:type="spellEnd"/>
     </w:p>
     <w:p>
       <w:pPr>
@@ -351,8 +381,13 @@
         <w:pStyle w:val="NoSpacing"/>
       </w:pPr>
       <w:r>
-        <w:t>Type: mcq</w:t>
-      </w:r>
+        <w:t xml:space="preserve">Type: </w:t>
+      </w:r>
+      <w:proofErr w:type="spellStart"/>
+      <w:r>
+        <w:t>mcq</w:t>
+      </w:r>
+      <w:proofErr w:type="spellEnd"/>
     </w:p>
     <w:p>
       <w:pPr>
@@ -424,7 +459,13 @@
         <w:pStyle w:val="NoSpacing"/>
       </w:pPr>
       <w:r>
-        <w:t>Question: The base of the ______ number system is 8.</w:t>
+        <w:t xml:space="preserve">Question: </w:t>
+      </w:r>
+      <w:r>
+        <w:t>1001001+0110110 =</w:t>
+      </w:r>
+      <w:r>
+        <w:t xml:space="preserve"> ______</w:t>
       </w:r>
     </w:p>
     <w:p>
@@ -440,7 +481,10 @@
         <w:pStyle w:val="NoSpacing"/>
       </w:pPr>
       <w:r>
-        <w:t>Answer: Octal</w:t>
+        <w:t xml:space="preserve">Answer: </w:t>
+      </w:r>
+      <w:r>
+        <w:t>1111111</w:t>
       </w:r>
     </w:p>
     <w:p>
@@ -496,7 +540,60 @@
         <w:pStyle w:val="NoSpacing"/>
       </w:pPr>
       <w:r>
-        <w:t>Question: The ______ method is used to convert a binary number into its decimal equivalent.</w:t>
+        <w:t xml:space="preserve">Question: </w:t>
+      </w:r>
+      <w:r>
+        <w:rPr>
+          <w:rFonts w:ascii="Arial" w:hAnsi="Arial" w:cs="Arial"/>
+          <w:color w:val="424242"/>
+          <w:sz w:val="20"/>
+          <w:szCs w:val="20"/>
+          <w:lang w:bidi="hi-IN"/>
+        </w:rPr>
+        <w:t xml:space="preserve">Convert </w:t>
+      </w:r>
+      <w:r>
+        <w:rPr>
+          <w:rFonts w:ascii="Arial" w:hAnsi="Arial" w:cs="Arial"/>
+          <w:color w:val="424242"/>
+          <w:sz w:val="20"/>
+          <w:szCs w:val="20"/>
+          <w:lang w:bidi="hi-IN"/>
+        </w:rPr>
+        <w:t xml:space="preserve">binary number </w:t>
+      </w:r>
+      <w:r>
+        <w:rPr>
+          <w:rFonts w:ascii="Arial" w:hAnsi="Arial" w:cs="Arial"/>
+          <w:color w:val="424242"/>
+          <w:sz w:val="20"/>
+          <w:szCs w:val="20"/>
+          <w:lang w:bidi="hi-IN"/>
+        </w:rPr>
+        <w:t>1001011</w:t>
+      </w:r>
+      <w:r>
+        <w:rPr>
+          <w:rFonts w:ascii="Arial" w:hAnsi="Arial" w:cs="Arial"/>
+          <w:color w:val="424242"/>
+          <w:sz w:val="16"/>
+          <w:szCs w:val="16"/>
+          <w:lang w:bidi="hi-IN"/>
+        </w:rPr>
+        <w:t xml:space="preserve"> </w:t>
+      </w:r>
+      <w:r>
+        <w:rPr>
+          <w:rFonts w:ascii="Arial" w:hAnsi="Arial" w:cs="Arial"/>
+          <w:color w:val="424242"/>
+          <w:sz w:val="20"/>
+          <w:szCs w:val="20"/>
+          <w:lang w:bidi="hi-IN"/>
+        </w:rPr>
+        <w:t>to Decimal</w:t>
+      </w:r>
+      <w:r>
+        <w:t>.</w:t>
       </w:r>
     </w:p>
     <w:p>
@@ -512,7 +609,10 @@
         <w:pStyle w:val="NoSpacing"/>
       </w:pPr>
       <w:r>
-        <w:t>Answer: Multiplication</w:t>
+        <w:t xml:space="preserve">Answer: </w:t>
+      </w:r>
+      <w:r>
+        <w:t>75</w:t>
       </w:r>
     </w:p>
     <w:p>
@@ -544,7 +644,19 @@
         <w:pStyle w:val="NoSpacing"/>
       </w:pPr>
       <w:r>
-        <w:t>Question: The ______ method is used to convert decimal numbers into binary numbers.</w:t>
+        <w:t xml:space="preserve">Question: </w:t>
+      </w:r>
+      <w:r>
+        <w:t xml:space="preserve">Convert </w:t>
+      </w:r>
+      <w:r>
+        <w:t xml:space="preserve">decimal number </w:t>
+      </w:r>
+      <w:r>
+        <w:t>45 to Binary</w:t>
+      </w:r>
+      <w:r>
+        <w:t>.</w:t>
       </w:r>
     </w:p>
     <w:p>
@@ -560,7 +672,10 @@
         <w:pStyle w:val="NoSpacing"/>
       </w:pPr>
       <w:r>
-        <w:t>Answer: Division</w:t>
+        <w:t xml:space="preserve">Answer: </w:t>
+      </w:r>
+      <w:r>
+        <w:t>101101</w:t>
       </w:r>
     </w:p>
     <w:p>
@@ -849,8 +964,13 @@
         <w:pStyle w:val="NoSpacing"/>
       </w:pPr>
       <w:r>
-        <w:t>Answer: hexa</w:t>
-      </w:r>
+        <w:t xml:space="preserve">Answer: </w:t>
+      </w:r>
+      <w:proofErr w:type="spellStart"/>
+      <w:r>
+        <w:t>hexa</w:t>
+      </w:r>
+      <w:proofErr w:type="spellEnd"/>
     </w:p>
     <w:p>
       <w:pPr>
@@ -880,40 +1000,68 @@
       <w:pPr>
         <w:pStyle w:val="NoSpacing"/>
       </w:pPr>
-      <w:r>
-        <w:t>Binary : 2</w:t>
-      </w:r>
-    </w:p>
-    <w:p>
-      <w:pPr>
-        <w:pStyle w:val="NoSpacing"/>
-      </w:pPr>
-      <w:r>
-        <w:t>Octal : 8</w:t>
-      </w:r>
-    </w:p>
-    <w:p>
-      <w:pPr>
-        <w:pStyle w:val="NoSpacing"/>
-      </w:pPr>
-      <w:r>
-        <w:t xml:space="preserve">Decimal : 10 </w:t>
-      </w:r>
-    </w:p>
-    <w:p>
-      <w:pPr>
-        <w:pStyle w:val="NoSpacing"/>
-      </w:pPr>
-      <w:r>
-        <w:t xml:space="preserve">Hexadecimal : 16 </w:t>
-      </w:r>
-    </w:p>
-    <w:p>
-      <w:pPr>
-        <w:pStyle w:val="NoSpacing"/>
-      </w:pPr>
-      <w:r>
-        <w:t>Machine Language : Binary</w:t>
+      <w:proofErr w:type="gramStart"/>
+      <w:r>
+        <w:t>Binary :</w:t>
+      </w:r>
+      <w:proofErr w:type="gramEnd"/>
+      <w:r>
+        <w:t xml:space="preserve"> 2</w:t>
+      </w:r>
+    </w:p>
+    <w:p>
+      <w:pPr>
+        <w:pStyle w:val="NoSpacing"/>
+      </w:pPr>
+      <w:proofErr w:type="gramStart"/>
+      <w:r>
+        <w:t>Octal :</w:t>
+      </w:r>
+      <w:proofErr w:type="gramEnd"/>
+      <w:r>
+        <w:t xml:space="preserve"> 8</w:t>
+      </w:r>
+    </w:p>
+    <w:p>
+      <w:pPr>
+        <w:pStyle w:val="NoSpacing"/>
+      </w:pPr>
+      <w:proofErr w:type="gramStart"/>
+      <w:r>
+        <w:t>Decimal :</w:t>
+      </w:r>
+      <w:proofErr w:type="gramEnd"/>
+      <w:r>
+        <w:t xml:space="preserve"> 10 </w:t>
+      </w:r>
+    </w:p>
+    <w:p>
+      <w:pPr>
+        <w:pStyle w:val="NoSpacing"/>
+      </w:pPr>
+      <w:proofErr w:type="gramStart"/>
+      <w:r>
+        <w:t>Hexadecimal :</w:t>
+      </w:r>
+      <w:proofErr w:type="gramEnd"/>
+      <w:r>
+        <w:t xml:space="preserve"> 16 </w:t>
+      </w:r>
+    </w:p>
+    <w:p>
+      <w:pPr>
+        <w:pStyle w:val="NoSpacing"/>
+      </w:pPr>
+      <w:r>
+        <w:t xml:space="preserve">Machine </w:t>
+      </w:r>
+      <w:proofErr w:type="gramStart"/>
+      <w:r>
+        <w:t>Language :</w:t>
+      </w:r>
+      <w:proofErr w:type="gramEnd"/>
+      <w:r>
+        <w:t xml:space="preserve"> Binary</w:t>
       </w:r>
     </w:p>
     <w:p>
@@ -937,7 +1085,15 @@
         <w:pStyle w:val="NoSpacing"/>
       </w:pPr>
       <w:r>
-        <w:t>Answer: Decimal to Binary : Division, Binary to Decimal : Multiplication, Even remainder : 0, Odd remainder : 1</w:t>
+        <w:t xml:space="preserve">Answer: Decimal to </w:t>
+      </w:r>
+      <w:proofErr w:type="gramStart"/>
+      <w:r>
+        <w:t>Binary :</w:t>
+      </w:r>
+      <w:proofErr w:type="gramEnd"/>
+      <w:r>
+        <w:t xml:space="preserve"> Division, Binary to Decimal : Multiplication, Even remainder : 0, Odd remainder : 1</w:t>
       </w:r>
     </w:p>
     <w:p>
@@ -961,7 +1117,15 @@
         <w:pStyle w:val="NoSpacing"/>
       </w:pPr>
       <w:r>
-        <w:t>Answer: (1011)2 : Binary, (75)8 : Octal, (99)10 : Decimal, (A2)16 : Hexadecimal</w:t>
+        <w:t>Answer: (1011)</w:t>
+      </w:r>
+      <w:proofErr w:type="gramStart"/>
+      <w:r>
+        <w:t>2 :</w:t>
+      </w:r>
+      <w:proofErr w:type="gramEnd"/>
+      <w:r>
+        <w:t xml:space="preserve"> Binary, (75)8 : Octal, (99)10 : Decimal, (A2)16 : Hexadecimal</w:t>
       </w:r>
     </w:p>
     <w:p>
@@ -985,24 +1149,134 @@
         <w:pStyle w:val="NoSpacing"/>
       </w:pPr>
       <w:r>
-        <w:t>Answer: 2^0 : 1, 2^1 : 2, 2^2 : 4, 2^3 : 8, 2^4 : 16</w:t>
-      </w:r>
-    </w:p>
-    <w:p>
-      <w:pPr>
-        <w:pStyle w:val="NoSpacing"/>
-      </w:pPr>
-      <w:r>
-        <w:t>Question: The octal number system uses digits from 0 to 9.</w:t>
-      </w:r>
-    </w:p>
-    <w:p>
-      <w:pPr>
-        <w:pStyle w:val="NoSpacing"/>
-      </w:pPr>
-      <w:r>
-        <w:t>Type: truefalse</w:t>
-      </w:r>
+        <w:t>Answer: 2^</w:t>
+      </w:r>
+      <w:proofErr w:type="gramStart"/>
+      <w:r>
+        <w:t>0 :</w:t>
+      </w:r>
+      <w:proofErr w:type="gramEnd"/>
+      <w:r>
+        <w:t xml:space="preserve"> 1, 2^1 : 2, 2^2 : 4, 2^3 : 8, 2^4 : 16</w:t>
+      </w:r>
+    </w:p>
+    <w:p>
+      <w:pPr>
+        <w:pStyle w:val="NoSpacing"/>
+      </w:pPr>
+      <w:r>
+        <w:t xml:space="preserve">Question: </w:t>
+      </w:r>
+      <w:r>
+        <w:t xml:space="preserve">In binary subtraction, </w:t>
+      </w:r>
+      <w:r>
+        <w:t>11110</w:t>
+      </w:r>
+      <w:r>
+        <w:t>-</w:t>
+      </w:r>
+      <w:r>
+        <w:t>01011</w:t>
+      </w:r>
+      <w:r>
+        <w:t xml:space="preserve"> is equal to 100</w:t>
+      </w:r>
+      <w:r>
+        <w:t>11</w:t>
+      </w:r>
+    </w:p>
+    <w:p>
+      <w:pPr>
+        <w:pStyle w:val="NoSpacing"/>
+      </w:pPr>
+      <w:r>
+        <w:t xml:space="preserve">Type: </w:t>
+      </w:r>
+      <w:proofErr w:type="spellStart"/>
+      <w:r>
+        <w:t>truefalse</w:t>
+      </w:r>
+      <w:proofErr w:type="spellEnd"/>
+    </w:p>
+    <w:p>
+      <w:pPr>
+        <w:pStyle w:val="NoSpacing"/>
+      </w:pPr>
+      <w:r>
+        <w:t xml:space="preserve">Answer: </w:t>
+      </w:r>
+      <w:r>
+        <w:t>true</w:t>
+      </w:r>
+    </w:p>
+    <w:p>
+      <w:pPr>
+        <w:pStyle w:val="NoSpacing"/>
+      </w:pPr>
+      <w:r>
+        <w:t>Question: A computer can only understand machine language.</w:t>
+      </w:r>
+    </w:p>
+    <w:p>
+      <w:pPr>
+        <w:pStyle w:val="NoSpacing"/>
+      </w:pPr>
+      <w:r>
+        <w:t xml:space="preserve">Type: </w:t>
+      </w:r>
+      <w:proofErr w:type="spellStart"/>
+      <w:r>
+        <w:t>truefalse</w:t>
+      </w:r>
+      <w:proofErr w:type="spellEnd"/>
+    </w:p>
+    <w:p>
+      <w:pPr>
+        <w:pStyle w:val="NoSpacing"/>
+      </w:pPr>
+      <w:r>
+        <w:t>Answer: true</w:t>
+      </w:r>
+    </w:p>
+    <w:p>
+      <w:pPr>
+        <w:pStyle w:val="NoSpacing"/>
+      </w:pPr>
+      <w:r>
+        <w:t>Question: In binary subtraction, 1</w:t>
+      </w:r>
+      <w:r>
+        <w:t>010</w:t>
+      </w:r>
+      <w:r>
+        <w:t xml:space="preserve"> -</w:t>
+      </w:r>
+      <w:r>
+        <w:t>0101</w:t>
+      </w:r>
+      <w:r>
+        <w:t xml:space="preserve"> is equal to </w:t>
+      </w:r>
+      <w:r>
+        <w:t>100</w:t>
+      </w:r>
+      <w:r>
+        <w:t>.</w:t>
+      </w:r>
+    </w:p>
+    <w:p>
+      <w:pPr>
+        <w:pStyle w:val="NoSpacing"/>
+      </w:pPr>
+      <w:r>
+        <w:t xml:space="preserve">Type: </w:t>
+      </w:r>
+      <w:proofErr w:type="spellStart"/>
+      <w:r>
+        <w:t>truefalse</w:t>
+      </w:r>
+      <w:proofErr w:type="spellEnd"/>
     </w:p>
     <w:p>
       <w:pPr>
@@ -1017,16 +1291,21 @@
         <w:pStyle w:val="NoSpacing"/>
       </w:pPr>
       <w:r>
-        <w:t>Question: A computer can only understand machine language.</w:t>
-      </w:r>
-    </w:p>
-    <w:p>
-      <w:pPr>
-        <w:pStyle w:val="NoSpacing"/>
-      </w:pPr>
-      <w:r>
-        <w:t>Type: truefalse</w:t>
-      </w:r>
+        <w:t>Question: The decimal number system is a positional value system.</w:t>
+      </w:r>
+    </w:p>
+    <w:p>
+      <w:pPr>
+        <w:pStyle w:val="NoSpacing"/>
+      </w:pPr>
+      <w:r>
+        <w:t xml:space="preserve">Type: </w:t>
+      </w:r>
+      <w:proofErr w:type="spellStart"/>
+      <w:r>
+        <w:t>truefalse</w:t>
+      </w:r>
+      <w:proofErr w:type="spellEnd"/>
     </w:p>
     <w:p>
       <w:pPr>
@@ -1041,16 +1320,21 @@
         <w:pStyle w:val="NoSpacing"/>
       </w:pPr>
       <w:r>
-        <w:t>Question: In binary subtraction, 1 - 0 is equal to 0.</w:t>
-      </w:r>
-    </w:p>
-    <w:p>
-      <w:pPr>
-        <w:pStyle w:val="NoSpacing"/>
-      </w:pPr>
-      <w:r>
-        <w:t>Type: truefalse</w:t>
-      </w:r>
+        <w:t>Question: The base of the binary number system is 10.</w:t>
+      </w:r>
+    </w:p>
+    <w:p>
+      <w:pPr>
+        <w:pStyle w:val="NoSpacing"/>
+      </w:pPr>
+      <w:r>
+        <w:t xml:space="preserve">Type: </w:t>
+      </w:r>
+      <w:proofErr w:type="spellStart"/>
+      <w:r>
+        <w:t>truefalse</w:t>
+      </w:r>
+      <w:proofErr w:type="spellEnd"/>
     </w:p>
     <w:p>
       <w:pPr>
@@ -1065,16 +1349,50 @@
         <w:pStyle w:val="NoSpacing"/>
       </w:pPr>
       <w:r>
-        <w:t>Question: The decimal number system is a positional value system.</w:t>
-      </w:r>
-    </w:p>
-    <w:p>
-      <w:pPr>
-        <w:pStyle w:val="NoSpacing"/>
-      </w:pPr>
-      <w:r>
-        <w:t>Type: truefalse</w:t>
-      </w:r>
+        <w:t>Question: In binary addition, 1 + 1 equals 2.</w:t>
+      </w:r>
+    </w:p>
+    <w:p>
+      <w:pPr>
+        <w:pStyle w:val="NoSpacing"/>
+      </w:pPr>
+      <w:r>
+        <w:t xml:space="preserve">Type: </w:t>
+      </w:r>
+      <w:proofErr w:type="spellStart"/>
+      <w:r>
+        <w:t>truefalse</w:t>
+      </w:r>
+      <w:proofErr w:type="spellEnd"/>
+    </w:p>
+    <w:p>
+      <w:pPr>
+        <w:pStyle w:val="NoSpacing"/>
+      </w:pPr>
+      <w:r>
+        <w:t>Answer: false</w:t>
+      </w:r>
+    </w:p>
+    <w:p>
+      <w:pPr>
+        <w:pStyle w:val="NoSpacing"/>
+      </w:pPr>
+      <w:r>
+        <w:t>Question: The letters A to F represent values from 10 to 15 in hexadecimal.</w:t>
+      </w:r>
+    </w:p>
+    <w:p>
+      <w:pPr>
+        <w:pStyle w:val="NoSpacing"/>
+      </w:pPr>
+      <w:r>
+        <w:t xml:space="preserve">Type: </w:t>
+      </w:r>
+      <w:proofErr w:type="spellStart"/>
+      <w:r>
+        <w:t>truefalse</w:t>
+      </w:r>
+      <w:proofErr w:type="spellEnd"/>
     </w:p>
     <w:p>
       <w:pPr>
@@ -1089,64 +1407,21 @@
         <w:pStyle w:val="NoSpacing"/>
       </w:pPr>
       <w:r>
-        <w:t>Question: The base of the binary number system is 10.</w:t>
-      </w:r>
-    </w:p>
-    <w:p>
-      <w:pPr>
-        <w:pStyle w:val="NoSpacing"/>
-      </w:pPr>
-      <w:r>
-        <w:t>Type: truefalse</w:t>
-      </w:r>
-    </w:p>
-    <w:p>
-      <w:pPr>
-        <w:pStyle w:val="NoSpacing"/>
-      </w:pPr>
-      <w:r>
-        <w:t>Answer: false</w:t>
-      </w:r>
-    </w:p>
-    <w:p>
-      <w:pPr>
-        <w:pStyle w:val="NoSpacing"/>
-      </w:pPr>
-      <w:r>
-        <w:t>Question: In binary addition, 1 + 1 equals 2.</w:t>
-      </w:r>
-    </w:p>
-    <w:p>
-      <w:pPr>
-        <w:pStyle w:val="NoSpacing"/>
-      </w:pPr>
-      <w:r>
-        <w:t>Type: truefalse</w:t>
-      </w:r>
-    </w:p>
-    <w:p>
-      <w:pPr>
-        <w:pStyle w:val="NoSpacing"/>
-      </w:pPr>
-      <w:r>
-        <w:t>Answer: false</w:t>
-      </w:r>
-    </w:p>
-    <w:p>
-      <w:pPr>
-        <w:pStyle w:val="NoSpacing"/>
-      </w:pPr>
-      <w:r>
-        <w:t>Question: The letters A to F represent values from 10 to 15 in hexadecimal.</w:t>
-      </w:r>
-    </w:p>
-    <w:p>
-      <w:pPr>
-        <w:pStyle w:val="NoSpacing"/>
-      </w:pPr>
-      <w:r>
-        <w:t>Type: truefalse</w:t>
-      </w:r>
+        <w:t>Question: The division method is used to convert decimal to binary.</w:t>
+      </w:r>
+    </w:p>
+    <w:p>
+      <w:pPr>
+        <w:pStyle w:val="NoSpacing"/>
+      </w:pPr>
+      <w:r>
+        <w:t xml:space="preserve">Type: </w:t>
+      </w:r>
+      <w:proofErr w:type="spellStart"/>
+      <w:r>
+        <w:t>truefalse</w:t>
+      </w:r>
+      <w:proofErr w:type="spellEnd"/>
     </w:p>
     <w:p>
       <w:pPr>
@@ -1161,30 +1436,6 @@
         <w:pStyle w:val="NoSpacing"/>
       </w:pPr>
       <w:r>
-        <w:t>Question: The division method is used to convert decimal to binary.</w:t>
-      </w:r>
-    </w:p>
-    <w:p>
-      <w:pPr>
-        <w:pStyle w:val="NoSpacing"/>
-      </w:pPr>
-      <w:r>
-        <w:t>Type: truefalse</w:t>
-      </w:r>
-    </w:p>
-    <w:p>
-      <w:pPr>
-        <w:pStyle w:val="NoSpacing"/>
-      </w:pPr>
-      <w:r>
-        <w:t>Answer: true</w:t>
-      </w:r>
-    </w:p>
-    <w:p>
-      <w:pPr>
-        <w:pStyle w:val="NoSpacing"/>
-      </w:pPr>
-      <w:r>
         <w:t>Question: Binary digit 1 means the switch is OFF.</w:t>
       </w:r>
     </w:p>
@@ -1193,8 +1444,13 @@
         <w:pStyle w:val="NoSpacing"/>
       </w:pPr>
       <w:r>
-        <w:t>Type: truefalse</w:t>
-      </w:r>
+        <w:t xml:space="preserve">Type: </w:t>
+      </w:r>
+      <w:proofErr w:type="spellStart"/>
+      <w:r>
+        <w:t>truefalse</w:t>
+      </w:r>
+      <w:proofErr w:type="spellEnd"/>
     </w:p>
     <w:p>
       <w:pPr>

</xml_diff>